<commit_message>
update analysis of recursive
</commit_message>
<xml_diff>
--- a/Analysis_and_Complexity_of_RecursiveAlgo.docx
+++ b/Analysis_and_Complexity_of_RecursiveAlgo.docx
@@ -142,28 +142,26 @@
         </w:numPr>
       </w:pPr>
       <w:r>
-        <w:t xml:space="preserve">The recursive call: </w:t>
-      </w:r>
-      <w:proofErr w:type="gramStart"/>
-      <w:r>
-        <w:t>helper(</w:t>
+        <w:t>The recursive call: helper(</w:t>
       </w:r>
       <w:proofErr w:type="spellStart"/>
-      <w:proofErr w:type="gramEnd"/>
       <w:r>
         <w:t>nums</w:t>
       </w:r>
       <w:proofErr w:type="spellEnd"/>
       <w:r>
-        <w:t xml:space="preserve">, index - 1, </w:t>
+        <w:t xml:space="preserve">, </w:t>
       </w:r>
       <w:proofErr w:type="spellStart"/>
       <w:r>
-        <w:t>maxSum</w:t>
+        <w:t>nums.length</w:t>
       </w:r>
       <w:proofErr w:type="spellEnd"/>
       <w:r>
-        <w:t>)</w:t>
+        <w:t xml:space="preserve"> </w:t>
+      </w:r>
+      <w:r>
+        <w:t>- 1)</w:t>
       </w:r>
     </w:p>
     <w:p>
@@ -240,15 +238,7 @@
           <w:sz w:val="22"/>
           <w:szCs w:val="22"/>
         </w:rPr>
-        <w:t>T</w:t>
-      </w:r>
-      <w:r>
-        <w:rPr>
-          <w:rFonts w:asciiTheme="minorHAnsi" w:hAnsiTheme="minorHAnsi" w:cstheme="minorHAnsi"/>
-          <w:sz w:val="22"/>
-          <w:szCs w:val="22"/>
-        </w:rPr>
-        <w:t xml:space="preserve">he dominant operation is the recursive call </w:t>
+        <w:t xml:space="preserve">The dominant operation is the recursive call </w:t>
       </w:r>
     </w:p>
     <w:p>
@@ -399,27 +389,7 @@
           <w:sz w:val="32"/>
           <w:szCs w:val="32"/>
         </w:rPr>
-        <w:t>T(n</w:t>
-      </w:r>
-      <w:r>
-        <w:rPr>
-          <w:b/>
-          <w:bCs/>
-          <w:color w:val="17365D" w:themeColor="text2" w:themeShade="BF"/>
-          <w:sz w:val="32"/>
-          <w:szCs w:val="32"/>
-        </w:rPr>
-        <w:t>)</w:t>
-      </w:r>
-      <w:r>
-        <w:rPr>
-          <w:b/>
-          <w:bCs/>
-          <w:color w:val="17365D" w:themeColor="text2" w:themeShade="BF"/>
-          <w:sz w:val="32"/>
-          <w:szCs w:val="32"/>
-        </w:rPr>
-        <w:t>=T(n-</w:t>
+        <w:t>T(n)=T(n-</w:t>
       </w:r>
       <w:proofErr w:type="gramStart"/>
       <w:r>
@@ -459,14 +429,7 @@
           <w:b/>
           <w:bCs/>
         </w:rPr>
-        <w:t xml:space="preserve"> </w:t>
-      </w:r>
-      <w:r>
-        <w:rPr>
-          <w:b/>
-          <w:bCs/>
-        </w:rPr>
-        <w:t>T(n)</w:t>
+        <w:t xml:space="preserve"> T(n)</w:t>
       </w:r>
       <w:r>
         <w:t>: Time complexity for an input of size (n).</w:t>
@@ -761,34 +724,7 @@
           <w:sz w:val="28"/>
           <w:szCs w:val="28"/>
         </w:rPr>
-        <w:t xml:space="preserve">                                                  </w:t>
-      </w:r>
-      <w:r>
-        <w:rPr>
-          <w:b/>
-          <w:bCs/>
-          <w:sz w:val="28"/>
-          <w:szCs w:val="28"/>
-        </w:rPr>
-        <w:t>T(n</w:t>
-      </w:r>
-      <w:r>
-        <w:rPr>
-          <w:b/>
-          <w:bCs/>
-          <w:sz w:val="28"/>
-          <w:szCs w:val="28"/>
-        </w:rPr>
-        <w:t>)</w:t>
-      </w:r>
-      <w:r>
-        <w:rPr>
-          <w:b/>
-          <w:bCs/>
-          <w:sz w:val="28"/>
-          <w:szCs w:val="28"/>
-        </w:rPr>
-        <w:t>=T(n-</w:t>
+        <w:t xml:space="preserve">                                                  T(n)=T(n-</w:t>
       </w:r>
       <w:proofErr w:type="gramStart"/>
       <w:r>
@@ -1385,23 +1321,7 @@
           <w:sz w:val="24"/>
           <w:szCs w:val="24"/>
         </w:rPr>
-        <w:t xml:space="preserve">of </w:t>
-      </w:r>
-      <w:r>
-        <w:rPr>
-          <w:rFonts w:eastAsia="Times New Roman" w:cstheme="minorHAnsi"/>
-          <w:sz w:val="24"/>
-          <w:szCs w:val="24"/>
-        </w:rPr>
-        <w:t xml:space="preserve"> </w:t>
-      </w:r>
-      <w:r>
-        <w:rPr>
-          <w:rFonts w:eastAsia="Times New Roman" w:cstheme="minorHAnsi"/>
-          <w:sz w:val="24"/>
-          <w:szCs w:val="24"/>
-        </w:rPr>
-        <w:t>C</w:t>
+        <w:t>of  C</w:t>
       </w:r>
       <w:proofErr w:type="gramEnd"/>
       <w:r>
@@ -1521,15 +1441,43 @@
           <w:sz w:val="24"/>
           <w:szCs w:val="24"/>
         </w:rPr>
-        <w:t>1</w:t>
-      </w:r>
-      <w:r>
+        <w:t>1)</w:t>
+      </w:r>
+    </w:p>
+    <w:p>
+      <w:pPr>
+        <w:ind w:left="720"/>
         <w:rPr>
           <w:rFonts w:eastAsia="Times New Roman" w:cstheme="minorHAnsi"/>
           <w:sz w:val="24"/>
           <w:szCs w:val="24"/>
         </w:rPr>
-        <w:t>)</w:t>
+      </w:pPr>
+      <w:r>
+        <w:rPr>
+          <w:rFonts w:eastAsia="Times New Roman" w:cstheme="minorHAnsi"/>
+          <w:sz w:val="24"/>
+          <w:szCs w:val="24"/>
+        </w:rPr>
+        <w:t xml:space="preserve">As noted in the handwriting, this results in a </w:t>
+      </w:r>
+      <w:r>
+        <w:rPr>
+          <w:rFonts w:eastAsia="Times New Roman" w:cstheme="minorHAnsi"/>
+          <w:b/>
+          <w:bCs/>
+          <w:sz w:val="24"/>
+          <w:szCs w:val="24"/>
+        </w:rPr>
+        <w:t>linear chain of (n+1) nodes</w:t>
+      </w:r>
+      <w:r>
+        <w:rPr>
+          <w:rFonts w:eastAsia="Times New Roman" w:cstheme="minorHAnsi"/>
+          <w:sz w:val="24"/>
+          <w:szCs w:val="24"/>
+        </w:rPr>
+        <w:t>.</w:t>
       </w:r>
     </w:p>
     <w:p>
@@ -1547,69 +1495,25 @@
           <w:sz w:val="24"/>
           <w:szCs w:val="24"/>
         </w:rPr>
-        <w:t xml:space="preserve">As noted in the handwriting, this results in a </w:t>
-      </w:r>
+        <w:t>Time complexity = O(n</w:t>
+      </w:r>
+      <w:proofErr w:type="gramStart"/>
       <w:r>
         <w:rPr>
           <w:rFonts w:eastAsia="Times New Roman" w:cstheme="minorHAnsi"/>
-          <w:b/>
-          <w:bCs/>
-          <w:sz w:val="24"/>
-          <w:szCs w:val="24"/>
-        </w:rPr>
-        <w:t>linear chain of (n+1) nodes</w:t>
-      </w:r>
+          <w:sz w:val="24"/>
+          <w:szCs w:val="24"/>
+        </w:rPr>
+        <w:t>) ,</w:t>
+      </w:r>
+      <w:proofErr w:type="gramEnd"/>
       <w:r>
         <w:rPr>
           <w:rFonts w:eastAsia="Times New Roman" w:cstheme="minorHAnsi"/>
           <w:sz w:val="24"/>
           <w:szCs w:val="24"/>
         </w:rPr>
-        <w:t>.</w:t>
-      </w:r>
-    </w:p>
-    <w:p>
-      <w:pPr>
-        <w:ind w:left="720"/>
-        <w:rPr>
-          <w:rFonts w:eastAsia="Times New Roman" w:cstheme="minorHAnsi"/>
-          <w:sz w:val="24"/>
-          <w:szCs w:val="24"/>
-        </w:rPr>
-      </w:pPr>
-      <w:r>
-        <w:rPr>
-          <w:rFonts w:eastAsia="Times New Roman" w:cstheme="minorHAnsi"/>
-          <w:sz w:val="24"/>
-          <w:szCs w:val="24"/>
-        </w:rPr>
-        <w:t>Time complexity = O(n</w:t>
-      </w:r>
-      <w:proofErr w:type="gramStart"/>
-      <w:r>
-        <w:rPr>
-          <w:rFonts w:eastAsia="Times New Roman" w:cstheme="minorHAnsi"/>
-          <w:sz w:val="24"/>
-          <w:szCs w:val="24"/>
-        </w:rPr>
-        <w:t>) ,</w:t>
-      </w:r>
-      <w:proofErr w:type="gramEnd"/>
-      <w:r>
-        <w:rPr>
-          <w:rFonts w:eastAsia="Times New Roman" w:cstheme="minorHAnsi"/>
-          <w:sz w:val="24"/>
-          <w:szCs w:val="24"/>
-        </w:rPr>
-        <w:t xml:space="preserve"> </w:t>
-      </w:r>
-      <w:r>
-        <w:rPr>
-          <w:rFonts w:eastAsia="Times New Roman" w:cstheme="minorHAnsi"/>
-          <w:sz w:val="24"/>
-          <w:szCs w:val="24"/>
-        </w:rPr>
-        <w:t>precisely Θ(n).</w:t>
+        <w:t xml:space="preserve"> precisely Θ(n).</w:t>
       </w:r>
     </w:p>
     <w:p>
@@ -3107,6 +3011,7 @@
   <w:style w:type="character" w:default="1" w:styleId="DefaultParagraphFont">
     <w:name w:val="Default Paragraph Font"/>
     <w:uiPriority w:val="1"/>
+    <w:semiHidden/>
     <w:unhideWhenUsed/>
   </w:style>
   <w:style w:type="table" w:default="1" w:styleId="TableNormal">

</xml_diff>